<commit_message>
docs: add Full_Script_Word_by_Word_Guru_Aqlan_dan_Mishka.docx and update Tab_2
</commit_message>
<xml_diff>
--- a/docs/Tab_2_Khusus_Guru_Script_Word_by_Word.docx
+++ b/docs/Tab_2_Khusus_Guru_Script_Word_by_Word.docx
@@ -8,9 +8,9 @@
           <w:rFonts w:ascii="Arial" w:hAnsi="Arial"/>
           <w:b/>
           <w:color w:val="0F172A"/>
-          <w:sz w:val="40"/>
+          <w:sz w:val="44"/>
         </w:rPr>
-        <w:t>🎙️ SCRIPT WORD-BY-WORD GURU &amp; STRUKTUR LES 60 MENIT</w:t>
+        <w:t>🎙️ FULL SCRIPT WORD-BY-WORD: PANDUAN MENGAJAR GURU</w:t>
       </w:r>
     </w:p>
     <w:p>
@@ -19,14 +19,16 @@
           <w:rFonts w:ascii="Arial" w:hAnsi="Arial"/>
           <w:i/>
           <w:color w:val="64748B"/>
-          <w:sz w:val="21"/>
+          <w:sz w:val="22"/>
         </w:rPr>
-        <w:t>Panduan Lengkap Guru: Canva Explaining + 15-18 Menit Menulis Aktif + Web Games Hands-on</w:t>
+        <w:t>PKBM Penerus Bangsa • Pembelajaran Privat 1-on-1: Aqlan (Kelas 4) &amp; Mishka (Kelas 5)</w:t>
+        <w:br/>
+        <w:t>Matematika (KPK &amp; FPB dari Nol) + IPAS (Energi &amp; Magnet Listrik) + Skema 60 Menit</w:t>
       </w:r>
     </w:p>
     <w:p>
       <w:pPr>
-        <w:spacing w:after="160"/>
+        <w:spacing w:after="200"/>
       </w:pPr>
     </w:p>
     <w:p>
@@ -34,7 +36,7 @@
         <w:pStyle w:val="Heading1"/>
       </w:pPr>
       <w:r>
-        <w:t>⏱️ STRUKTUR ALOKASI WAKTU 60 MENIT (STANDAR LES PRIVAT)</w:t>
+        <w:t>⏱️ STRUKTUR RUNDOWN WAKTU 60 MENIT (STANDAR LES PRIVAT)</w:t>
       </w:r>
     </w:p>
     <w:p>
@@ -45,7 +47,7 @@
         <w:t xml:space="preserve">• Menit 00–05 (5 Menit): </w:t>
       </w:r>
       <w:r>
-        <w:t>Mood Check-in &amp; Pemanasan. Tanya santai tentang latihan skateboard/senam + klik mood di web game.</w:t>
+        <w:t>Mood Check-in &amp; Pemanasan. Tanya santai kabar latihan skateboard/senam + klik mood emosi di web game.</w:t>
         <w:br/>
       </w:r>
       <w:r>
@@ -55,7 +57,7 @@
         <w:t xml:space="preserve">• Menit 05–17 (12 Menit): </w:t>
       </w:r>
       <w:r>
-        <w:t>Teori Padat &amp; Misteri Soal (Slide 1 &amp; 2). Menghadapkan siswa pada inti masalah secara lugas tanpa membingungkan.</w:t>
+        <w:t>Teori Padat &amp; Narasi Inti (Slide 1 &amp; 2). Menghadapkan siswa pada inti misteri soal secara lugas tanpa membingungkan.</w:t>
         <w:br/>
       </w:r>
       <w:r>
@@ -65,7 +67,7 @@
         <w:t xml:space="preserve">• Menit 17–27 (10 Menit): </w:t>
       </w:r>
       <w:r>
-        <w:t>💡 Jembatan Imajinasi Kinestetik (Slide 3). Membawa materi ke dunia nyata anak (Skater &amp; Pesenam) untuk memicu 'Aha! Moment'.</w:t>
+        <w:t>💡 Jembatan Imajinasi Kinestetik &amp; Solusi STEM (Slide 3). Membawa materi ke dunia nyata anak (Skater &amp; Pesenam) untuk memicu 'Aha! Moment'.</w:t>
         <w:br/>
       </w:r>
       <w:r>
@@ -75,7 +77,7 @@
         <w:t xml:space="preserve">• Menit 27–44 (17 Menit): </w:t>
       </w:r>
       <w:r>
-        <w:t>✍️ BLOK EMAS: AKTIF MENULIS SISWA (15–18 MENIT). Siswa fokus menulis mandiri di buku tulis fisik (menggambar pohon faktor, lintasan, dan rumus emas).</w:t>
+        <w:t>✍️ BLOK EMAS: AKTIF MENULIS SISWA (15–18 MENIT). Siswa fokus menulis mandiri di buku tulis fisik (menggambar pohon faktor, lintasan, dan rumus emas tanpa terdistraksi layar).</w:t>
         <w:br/>
       </w:r>
       <w:r>
@@ -100,7 +102,7 @@
     </w:p>
     <w:p>
       <w:pPr>
-        <w:spacing w:after="160"/>
+        <w:spacing w:after="240"/>
       </w:pPr>
     </w:p>
     <w:p>
@@ -108,7 +110,15 @@
         <w:pStyle w:val="Heading1"/>
       </w:pPr>
       <w:r>
-        <w:t>🧒 JALUR 1: SESI AQLAN (KELAS 4)</w:t>
+        <w:t>🧒 JALUR 1: AQLAN (KELAS 4 - FASE B)</w:t>
+      </w:r>
+    </w:p>
+    <w:p>
+      <w:pPr>
+        <w:pStyle w:val="Heading2"/>
+      </w:pPr>
+      <w:r>
+        <w:t>📐 MATEMATIKA: FPB &amp; KPK DASAR (6 SLIDE CANVA + BLOK MENULIS)</w:t>
       </w:r>
     </w:p>
     <w:p>
@@ -116,7 +126,7 @@
         <w:pStyle w:val="Heading3"/>
       </w:pPr>
       <w:r>
-        <w:t>📌 Slide 1: The Running Lap Challenge (Misteri Dua Pelari di Garis START)</w:t>
+        <w:t>📌 Slide 1: The Running Lap Challenge (Misteri Garis START)</w:t>
       </w:r>
     </w:p>
     <w:p>
@@ -156,7 +166,7 @@
         <w:t>Aqlan: 'Bakal ketemu lagi di garis START, Bu!'</w:t>
         <w:br/>
         <w:br/>
-        <w:t>Guru: 'Keren! Kenapa Aqlan yakin mereka bakal ketemu lagi di garis START, padahal waktu satu putarannya beda (3 menit vs 4 menit)?'</w:t>
+        <w:t>Guru (Menantang Logika): 'Keren! Kenapa Aqlan yakin mereka bakal ketemu lagi di garis START, padahal waktu satu putarannya beda (3 menit vs 4 menit)?'</w:t>
         <w:br/>
         <w:br/>
         <w:t>Aqlan: 'Soalnya waktu kan terus berjalan maju, Bu. Nanti ada menit tertentu di mana putaran mereka pas sama-sama selesai pas di garis start!'</w:t>
@@ -182,7 +192,7 @@
         <w:br/>
       </w:r>
       <w:r>
-        <w:t>Kelipatan = Lompatan Tambah-Tambah Angka yang Sama!</w:t>
+        <w:t>Kelipatan = Lompatan Tambah-Tambah Angka yang Sama dari Titik Nol!</w:t>
         <w:br/>
         <w:t>• The Boy (tiap 3 menit) : Mulai 0 ➜ Tambah 3 terus: 3, 6, 9, 🟢 12, 15, 18, 21, 🟢 24...</w:t>
         <w:br/>
@@ -201,7 +211,7 @@
         <w:br/>
       </w:r>
       <w:r>
-        <w:t>Guru: 'Aqlan, dari mana sih datangnya angka-angka menit ini? Apakah harus dihafal dari tabel perkalian? Jawabannya: NGGAK PERLU DIHAFAL! Kita bisa temukan sendiri dari titik nol pakai Lompatan Tambah-Tambah!</w:t>
+        <w:t>Guru: 'Aqlan, dari mana sih datangnya angka-angka menit ini? Apakah harus dihafal dari tabel perkalian yang kaku? Jawabannya: NGGAK PERLU DIHAFAL! Kita bisa temukan sendiri dari titik nol pakai Lompatan Tambah-Tambah!</w:t>
         <w:br/>
         <w:br/>
         <w:t>Coba perhatikan The Boy: saat peluit bunyi di garis start, stopwatch masih di angka 0.</w:t>
@@ -229,7 +239,7 @@
         <w:t>Guru: 'Bagus sekali! Sekarang giliran The Girl yang larinya 4 menit. Mulai dari 0: tambah 4 jadi 4, tambah 4 lagi jadi 8, tambah 4 lagi jadi 12!</w:t>
         <w:br/>
         <w:br/>
-        <w:t>Nah Aqlan, Lompat Tambah-Tambah Angka yang Sama inilah yang di matematika dinamakan Kelipatan! Jadi kalau Aqlan lupa perkalian, cukup ingat: tinggal ditambah-tambah angka yang sama terus! Coba Aqlan lihat garis waktunya: di menit ke berapa panah mereka mendarat di angka yang persis sama?'</w:t>
+        <w:t>Nah Aqlan, Lompat Tambah-Tambah Angka yang Sama inilah yang di matematika dinamakan Kelipatan! Jadi kalau Aqlan lupa perkalian, cukup ingat: tinggal ditambah-tambah angka yang sama terus! Coba Aqlan lihat garis waktunya: di menit ke berapa panah mereka mendarat di angka yang persis sama untuk pertama kalinya?'</w:t>
         <w:br/>
         <w:br/>
         <w:t>Aqlan: 'Di menit ke-12 dan menit ke-24, Bu!'</w:t>
@@ -286,7 +296,7 @@
         <w:t>Pada menit ke-12, The Boy yang larinya lebih kencang sudah dapat 4 putaran (12 ÷ 3 = 4), dan The Girl dapat 3 putaran (12 ÷ 4 = 3). Keduanya pas menginjak garis start bersamaan!</w:t>
         <w:br/>
         <w:br/>
-        <w:t>Nah Aqlan, ini persis banget kalau kamu lagi main skateboard di skatepark! Bayangkan kamu meluncur bolak-balik di mini-ramp tiap 3 detik, temanmu tiap 4 detik. Supaya kalian berdua bisa melakukan trik drop-in sync yang keren bareng-bareng di puncak ramp tanpa tabrakan, kalian harus meluncur bersamaan di detik ke berapa?'</w:t>
+        <w:t>Nah Aqlan, ini persis banget kalau kamu lagi main skateboard di skatepark! Bayangkan kamu meluncur bolak-balik di mini-ramp tiap 3 detik, temanmu tiap 4 detik. Supaya kalian berdua bisa melakukan trik drop-in sync yang keren bareng-bareng di puncak ramp tanpa tabrakan di udara (mid-air collision), kalian harus meluncur bersamaan di detik ke berapa?'</w:t>
         <w:br/>
         <w:br/>
         <w:t>Aqlan: 'Di detik ke-12, Bu!'</w:t>
@@ -295,7 +305,9 @@
         <w:t>Guru: 'BINGO! KPK itu sebenarnya adalah ritme sinkronisasi trik atlet pro agar gerakan meluncur selalu pas dan aman!</w:t>
         <w:br/>
         <w:br/>
-        <w:t>🎙️ TRANSISI KE BLOK MENULIS (15–18 MENIT): Skater dan atlet hebat itu nggak cuma jago trik di lapangan, tapi juga punya catatan strategi juara di buku! Sekarang Aqlan siapkan buku catatan tulismu dan pulpen favoritmu. Selama 15–18 menit ke depan, Aqlan akan menggambar lintasan mini-ramp ini dan mencatat rumus rahasia KPK di buku tulismu. Yuk kita buka buku catatan sekarang!'</w:t>
+        <w:t>🎙️ TRANSISI GURU MENUJU SESI MENULIS (15–18 MENIT):</w:t>
+        <w:br/>
+        <w:t>Guru: 'Skater dan atlet hebat itu nggak cuma jago trik di lapangan, tapi juga punya catatan strategi juara di buku! Sekarang Aqlan siapkan buku catatan tulismu dan pulpen favoritmu. Selama 15–18 menit ke depan, Aqlan akan menggambar lintasan mini-ramp ini dan mencatat rumus rahasia KPK di buku tulismu. Yuk kita buka buku catatan sekarang!'</w:t>
       </w:r>
     </w:p>
     <w:p>
@@ -332,7 +344,7 @@
         <w:br/>
       </w:r>
       <w:r>
-        <w:t>Guru: 'Sekarang kita masuk ke misteri kedua: FPB! Tapi dari mana sih faktor itu ditemukan? Ibu punya 12 donat cokelat di meja. Kita mau cari angka pembagi yang PAS HABIS TANPA SISA supaya teman-teman nggak ada yang rebutan.</w:t>
+        <w:t>Guru: 'Sekarang kita masuk ke misteri kedua: FPB! Tapi dari mana sih faktor itu ditemukan dari nol? Ibu punya 12 donat cokelat di meja. Kita mau cari angka pembagi yang PAS HABIS TANPA SISA supaya teman-teman nggak ada yang rebutan.</w:t>
         <w:br/>
         <w:t>• Kalau dibagi ke 1 piring: pas 12 donat (sisa 0).</w:t>
         <w:br/>
@@ -375,6 +387,8 @@
         <w:br/>
         <w:t>• Faktor 18 : 1, 2, 3, 🟢 6, 9, 18</w:t>
         <w:br/>
+        <w:t>Faktor Pembagi yang Sama: 1, 2, 3, dan 6.</w:t>
+        <w:br/>
         <w:t>🎁 FPB = Pilih Pembagi PALING BESAR = 6 Kotak / Pouch Toolkit Terbanyak!</w:t>
         <w:br/>
         <w:br/>
@@ -394,7 +408,7 @@
         <w:t>Aqlan: 'Angka 6, Bu!'</w:t>
         <w:br/>
         <w:br/>
-        <w:t>Guru: 'Tepat! Kenapa kita pilih angka 6, bukan angka 2 atau 3?'</w:t>
+        <w:t>Guru (Teknik Diskusi): 'Tepat! Kenapa kita pilih angka 6, bukan angka 2 atau 3?'</w:t>
         <w:br/>
         <w:br/>
         <w:t>Aqlan: 'Kan kita mau bikin paket hadiah sebanyak-banyaknya, jadi pilih angka pembagi yang paling besar!'</w:t>
@@ -408,7 +422,7 @@
         <w:pStyle w:val="Heading3"/>
       </w:pPr>
       <w:r>
-        <w:t>📌 Slide 6: Peta Rahasia Soal Cerita + Gerbang Web Game</w:t>
+        <w:t>📌 Slide 6: Peta Rahasia Soal Cerita (KPK vs FPB) + Gerbang Game</w:t>
       </w:r>
     </w:p>
     <w:p>
@@ -438,6 +452,254 @@
       </w:r>
       <w:r>
         <w:t>Guru: 'Aqlan, simpan kunci rahasia ini di kepalamu: Kalau soal ceritanya tentang berlari maju mencari waktu bertemu bersama lagi di garis start atau jadwal bersama, itu KPK! Tapi kalau ceritanya tentang membagi-bagi makanan ke wadah sama rata tanpa sisa, itu FPB! Nah, teorinya Aqlan sudah kuasai 100%. Sekarang saatnya kita buktikan kemampuan detektifmu di website game! Buka link web game Aqlan sekarang ya, kita mulai dari tombol perasaan How are you today lalu kita warnai tabel angkanya!'</w:t>
+      </w:r>
+    </w:p>
+    <w:p>
+      <w:pPr>
+        <w:pStyle w:val="Heading2"/>
+      </w:pPr>
+      <w:r>
+        <w:t>🔬 IPAS (KELAS 4): BAB 4 MENGUBAH BENTUK ENERGI</w:t>
+      </w:r>
+    </w:p>
+    <w:p>
+      <w:pPr>
+        <w:pStyle w:val="Heading3"/>
+      </w:pPr>
+      <w:r>
+        <w:t>📌 Slide 1: Misi Detektif: Energi Tidak Pernah Mati</w:t>
+      </w:r>
+    </w:p>
+    <w:p>
+      <w:r>
+        <w:rPr>
+          <w:b/>
+        </w:rPr>
+        <w:t>Teks di Slide Canva:</w:t>
+        <w:br/>
+      </w:r>
+      <w:r>
+        <w:t>Hukum Rahasia Energi:</w:t>
+        <w:br/>
+        <w:t>Energi tidak bisa diciptakan dari nol, dan tidak bisa dimusnahkan.</w:t>
+        <w:br/>
+        <w:t>Energi hanya bisa BERGANTI TOPENG (Berubah Bentuk)!</w:t>
+        <w:br/>
+        <w:br/>
+      </w:r>
+      <w:r>
+        <w:rPr>
+          <w:b/>
+          <w:color w:val="10B981"/>
+        </w:rPr>
+        <w:t>🎙️ Naskah Dialog Guru (Word-by-Word):</w:t>
+        <w:br/>
+      </w:r>
+      <w:r>
+        <w:t>Guru: 'Aqlan, bayangkan energi itu seperti pahlawan super ajaib. Dia tidak bisa mati dan tidak bisa dihancurkan oleh monster apapun. Tapi dia punya satu keahlian unik: dia suka menyamar dan berganti topeng! Hari ini misi Aqlan adalah membongkar topeng-topeng perubahan energi di sekitar kita!'</w:t>
+      </w:r>
+    </w:p>
+    <w:p>
+      <w:pPr>
+        <w:pStyle w:val="Heading3"/>
+      </w:pPr>
+      <w:r>
+        <w:t>📌 Slide 2: Energi Tersimpan (Kimia pada Makanan)</w:t>
+      </w:r>
+    </w:p>
+    <w:p>
+      <w:r>
+        <w:rPr>
+          <w:b/>
+        </w:rPr>
+        <w:t>Teks di Slide Canva:</w:t>
+        <w:br/>
+      </w:r>
+      <w:r>
+        <w:t>Energi Kimia (Makanan) ──► Energi Gerak (Otot Tubuh) + Panas Tubuh</w:t>
+        <w:br/>
+        <w:br/>
+      </w:r>
+      <w:r>
+        <w:rPr>
+          <w:b/>
+          <w:color w:val="10B981"/>
+        </w:rPr>
+        <w:t>🎙️ Naskah Dialog Guru (Word-by-Word):</w:t>
+        <w:br/>
+      </w:r>
+      <w:r>
+        <w:t>Guru: 'Aqlan, kalau dari pagi kamu belum sarapan sama sekali, rasanya gimana waktu disuruh main skateboard keliling lapangan?'</w:t>
+        <w:br/>
+        <w:t>Aqlan: 'Lemas banget, Bu, capek.'</w:t>
+        <w:br/>
+        <w:t>Guru: 'Tepat! Di dalam sepiring nasi tersimpan Energi Kimia. Saat dicerna perut Aqlan, energi kimianya berubah menjadi Energi Gerak di otot, plus bikin badan Aqlan hangat. Jadi makanan itu seperti bensin untuk mobil!'</w:t>
+      </w:r>
+    </w:p>
+    <w:p>
+      <w:pPr>
+        <w:pStyle w:val="Heading3"/>
+      </w:pPr>
+      <w:r>
+        <w:t>📌 Slide 3: Energi Tersimpan pada Benda (Baterai &amp; Ramp Skate)</w:t>
+      </w:r>
+    </w:p>
+    <w:p>
+      <w:r>
+        <w:rPr>
+          <w:b/>
+        </w:rPr>
+        <w:t>Teks di Slide Canva:</w:t>
+        <w:br/>
+      </w:r>
+      <w:r>
+        <w:t>Energi Potensial = Energi yang Sedang Tidur / Tersimpan!</w:t>
+        <w:br/>
+        <w:t>1. Energi Kimia Baterai</w:t>
+        <w:br/>
+        <w:t>2. Energi Potensial Gravitasi Ramp Skate &amp; Pegas Ketapel</w:t>
+        <w:br/>
+        <w:br/>
+      </w:r>
+      <w:r>
+        <w:rPr>
+          <w:b/>
+          <w:color w:val="10B981"/>
+        </w:rPr>
+        <w:t>🎙️ Naskah Dialog Guru (Word-by-Word):</w:t>
+        <w:br/>
+      </w:r>
+      <w:r>
+        <w:t>Guru: 'Saat karet ketapel ditarik ke belakang, batunya belum bergerak kan? Tapi karetnya menyimpan tenaga yang sangat kuat bernama Energi Potensial Pegas. Begitu tarikan dilepas... Wuuush! Berubah jadi energi gerak, melesat cepat!</w:t>
+        <w:br/>
+        <w:t>Sama seperti saat papan skate Aqlan diam di atas puncak ramp: menyimpan energi potensial gravitasi, begitu meluncur berubah jadi energi kinetik gerak!'</w:t>
+      </w:r>
+    </w:p>
+    <w:p>
+      <w:pPr>
+        <w:pStyle w:val="Heading3"/>
+      </w:pPr>
+      <w:r>
+        <w:t>📌 Slide 4: Lab Rumah Tangga (Transformasi Energi Listrik)</w:t>
+      </w:r>
+    </w:p>
+    <w:p>
+      <w:r>
+        <w:rPr>
+          <w:b/>
+        </w:rPr>
+        <w:t>Teks di Slide Canva:</w:t>
+        <w:br/>
+      </w:r>
+      <w:r>
+        <w:t>Setrika ➜ Panas | Kipas ➜ Gerak | TV ➜ Cahaya &amp; Suara</w:t>
+        <w:br/>
+        <w:br/>
+      </w:r>
+      <w:r>
+        <w:rPr>
+          <w:b/>
+          <w:color w:val="10B981"/>
+        </w:rPr>
+        <w:t>🎙️ Naskah Dialog Guru (Word-by-Word):</w:t>
+        <w:br/>
+      </w:r>
+      <w:r>
+        <w:t>Guru: 'Kalau kabel listrik colokan dialirkan ke setrika, topeng listriknya berubah jadi apa?'</w:t>
+        <w:br/>
+        <w:t>Aqlan: 'Jadi panas, Bu!'</w:t>
+        <w:br/>
+        <w:t>Guru: 'Kalau dicolokkan ke kipas angin?'</w:t>
+        <w:br/>
+        <w:t>Aqlan: 'Jadi gerak baling-baling!'</w:t>
+        <w:br/>
+        <w:t>Guru: 'Kalau ke televisi?'</w:t>
+        <w:br/>
+        <w:t>Aqlan: 'Jadi gambar cahaya dan suara film!'</w:t>
+        <w:br/>
+        <w:t>Guru: 'Luar biasa! Sumbernya sama-sama listrik, tapi alatnya mengubah menjadi topeng yang berbeda-beda.'</w:t>
+      </w:r>
+    </w:p>
+    <w:p>
+      <w:pPr>
+        <w:pStyle w:val="Heading3"/>
+      </w:pPr>
+      <w:r>
+        <w:t>📌 Slide 5: Rahasia Energi Sampingan (Miskonsepsi Lampu Panas)</w:t>
+      </w:r>
+    </w:p>
+    <w:p>
+      <w:r>
+        <w:rPr>
+          <w:b/>
+        </w:rPr>
+        <w:t>Teks di Slide Canva:</w:t>
+        <w:br/>
+      </w:r>
+      <w:r>
+        <w:t>Tujuan Utama: Energi Cahaya 💡 | Energi Sampingan: Energi Panas 🔥</w:t>
+        <w:br/>
+        <w:br/>
+      </w:r>
+      <w:r>
+        <w:rPr>
+          <w:b/>
+          <w:color w:val="10B981"/>
+        </w:rPr>
+        <w:t>🎙️ Naskah Dialog Guru (Word-by-Word):</w:t>
+        <w:br/>
+      </w:r>
+      <w:r>
+        <w:t>Guru: 'Waktu menyalakan lampu belajar, tujuan kita kan cuma mau cari terang cahaya. Tapi kenapa kalau sudah nyala 2 jam dan kita dekatkan tangan terasa panas?'</w:t>
+        <w:br/>
+        <w:t>Aqlan: 'Karena listriknya bocor jadi panas, Bu?'</w:t>
+        <w:br/>
+        <w:t>Guru: 'Analisis cerdas! Sebagian energi listrik tidak semuanya berhasil diubah jadi cahaya, sebagian kecil terbuang jadi energi panas akibat hambatan kabel. Makanya sekarang ada lampu LED hemat energi yang tidak banyak membuang energi jadi panas!'</w:t>
+      </w:r>
+    </w:p>
+    <w:p>
+      <w:pPr>
+        <w:pStyle w:val="Heading3"/>
+      </w:pPr>
+      <w:r>
+        <w:t>📌 Slide 6: Misi 60 Detik Kamar Aqlan</w:t>
+      </w:r>
+    </w:p>
+    <w:p>
+      <w:r>
+        <w:rPr>
+          <w:b/>
+        </w:rPr>
+        <w:t>Teks di Slide Canva:</w:t>
+        <w:br/>
+      </w:r>
+      <w:r>
+        <w:t>Misi: Ambil 1 Benda Baterai di Kamarmu Sekarang!</w:t>
+        <w:br/>
+        <w:t>Telusuri alur perubahannya: Energi ... ➜ Energi ... ➜ Energi ...</w:t>
+        <w:br/>
+        <w:br/>
+      </w:r>
+      <w:r>
+        <w:rPr>
+          <w:b/>
+          <w:color w:val="10B981"/>
+        </w:rPr>
+        <w:t>🎙️ Naskah Dialog Guru (Word-by-Word):</w:t>
+        <w:br/>
+      </w:r>
+      <w:r>
+        <w:t>Guru: 'Sekarang Ibu beri waktu 30 detik untuk Detektif Aqlan: Coba cari dan ambil 1 benda di kamarmu yang pakai baterai! Tunjukkan ke kamera dan jelaskan perubahannya!'</w:t>
+        <w:br/>
+        <w:t>(Aqlan mengambil mobil mainan)</w:t>
+        <w:br/>
+        <w:t>Aqlan: 'Ini Bu, mobil-mobilan mainan!'</w:t>
+        <w:br/>
+        <w:t>Guru: 'Keren! Dari mana perubahannya?'</w:t>
+        <w:br/>
+        <w:t>Aqlan: 'Dari kimia baterai, ke listrik kabel, terus ke gerak roda!'</w:t>
+        <w:br/>
+        <w:t>Guru: '1000 buat Detektif Aqlan! Analisis sempurna!'</w:t>
       </w:r>
     </w:p>
     <w:p>
@@ -450,7 +712,15 @@
         <w:pStyle w:val="Heading1"/>
       </w:pPr>
       <w:r>
-        <w:t>👧 JALUR 2: SESI MISHKA (KELAS 5)</w:t>
+        <w:t>👧 JALUR 2: MISHKA (KELAS 5 - FASE C)</w:t>
+      </w:r>
+    </w:p>
+    <w:p>
+      <w:pPr>
+        <w:pStyle w:val="Heading2"/>
+      </w:pPr>
+      <w:r>
+        <w:t>📐 MATEMATIKA: FPB &amp; KPK TERAPAN KE PECAHAN (6 SLIDE CANVA + BLOK MENULIS)</w:t>
       </w:r>
     </w:p>
     <w:p>
@@ -503,7 +773,7 @@
         <w:t>Mishka: 'Nggak adil sama sekali, Bu! Kan potongan pizza keju jauh lebih gede daripada pizza sosis. Ukuran potongannya beda!'</w:t>
         <w:br/>
         <w:br/>
-        <w:t>Guru: 'TEPAT SEKALI! Logika dan insting keadilan Mishka bekerja sempurna! Angka di bawah (penyebut) itu adalah UKURAN POTONGAN, bukan sekadar jumlah hitungan benda! 1 potongan raksasa tidak bisa dijumlahkan langsung dengan 1 potongan ramping. Kalau dipaksakan, hitungannya kacau dan timpang! Supaya kita bisa menjumlahkannya secara adil dan sah, apa yang harus kita lakukan pada kedua loyang pizza ini?'</w:t>
+        <w:t>Guru (Menerjemahkan Ketidakpastian): 'TEPAT SEKALI! Logika dan insting keadilan Mishka bekerja sempurna! Angka di bawah (penyebut) itu adalah UKURAN POTONGAN, bukan sekadar jumlah hitungan benda! 1 potongan raksasa tidak bisa dijumlahkan langsung dengan 1 potongan ramping. Kalau dipaksakan, hitungannya kacau dan timpang! Supaya kita bisa menjumlahkannya secara adil dan sah, apa yang harus kita lakukan pada kedua loyang pizza ini?'</w:t>
         <w:br/>
         <w:br/>
         <w:t>Mishka: 'Harus dipotong ulang jadi irisan-irisan kecil yang besarnya sama persis, Bu!'</w:t>
@@ -619,7 +889,9 @@
         <w:t>Tapi berkat KPK = 12: Gerakan salto setara dengan 3 ketukan per-12 (3/12). Gerakan piruet setara dengan 2 ketukan per-12 (2/12). Ketika digabungkan, total durasinya pas 5 ketukan! Dan tepat di ketukan gong ke-12, kedua kaki mendarat kokoh di matras tanpa goyah sedikit pun (perfect stick landing)! Seluruh juri berdiri bertepuk tangan dan memberi nilai 10 mutlak! KPK di sini bukan sekadar matematika, tapi adalah instrumen keindahan dan keselamatan atlet!</w:t>
         <w:br/>
         <w:br/>
-        <w:t>🎙️ TRANSISI KE BLOK MENULIS (15–18 MENIT): Seorang koreografer kelas dunia selalu mengabadikan strategi juaranya di buku catatan. Sekarang Mishka siapkan buku catatan fisik dan spidol warna favoritmu. Selama 15–18 menit ke depan, Mishka akan menggambar pohon faktor balok lego dan mencatat rumus penyelaras ketukan 12 ini di buku tulismu. Yuk kita buka buku catatan sekarang!'</w:t>
+        <w:t>🎙️ TRANSISI GURU MENUJU SESI MENULIS (15–18 MENIT):</w:t>
+        <w:br/>
+        <w:t>Guru: 'Seorang koreografer kelas dunia selalu mengabadikan strategi juaranya di buku catatan. Sekarang Mishka siapkan buku catatan fisik dan spidol warna favoritmu. Selama 15–18 menit ke depan, Mishka akan menggambar pohon faktor balok lego dan mencatat rumus penyelaras ketukan 12 ini di buku tulismu. Yuk kita buka buku catatan sekarang!'</w:t>
       </w:r>
     </w:p>
     <w:p>
@@ -643,7 +915,7 @@
         <w:br/>
         <w:t>3 potong keju + 2 potong sosis = 5 potong dari total 12 bagian!</w:t>
         <w:br/>
-        <w:t>1/4 + 1/6 = 3/12 + 2/12 = 5/12</w:t>
+        <w:t>1/4 + 1/6 = 3/12 + 2/12 = (3 + 2)/12 = 5/12</w:t>
         <w:br/>
         <w:t>⚠️ Penyebut TETAP 12, tidak dijumlahkan menjadi 24!</w:t>
         <w:br/>
@@ -660,15 +932,11 @@
       <w:r>
         <w:t>Guru: 'Sekarang potongannya sudah sama-sama per-12. Ada 3 potong kecil keju ditambah 2 potong kecil sosis. Totalnya ada berapa potong kecil, Mishka?'</w:t>
         <w:br/>
-        <w:br/>
         <w:t>Mishka: 'Ada 5 potong dari 12, jadi 5/12!'</w:t>
         <w:br/>
-        <w:br/>
-        <w:t>Guru: 'Oke, kenapa angka 12 di bawahnya tidak ikut dijumlahkan jadi 24? Apa relevansinya dengan satu loyang pizza tadi?'</w:t>
-        <w:br/>
+        <w:t>Guru: 'Kenapa angka 12 di bawahnya tidak ikut dijumlahkan jadi 24? Apa relevansinya dengan satu loyang pizza tadi?'</w:t>
         <w:br/>
         <w:t>Mishka: 'Karena satu loyang pizzanya tetap dipotong 12 bagian, Bu, bukan berubah jadi 24 bagian.'</w:t>
-        <w:br/>
         <w:br/>
         <w:t>Guru: 'Jawaban tingkat tinggi! Mishka benar-benar paham logikanya, bukan cuma hafal rumus!'</w:t>
       </w:r>
@@ -678,7 +946,7 @@
         <w:pStyle w:val="Heading3"/>
       </w:pPr>
       <w:r>
-        <w:t>📌 Slide 5: Konsep Dasar FPB dari Nol &amp; Kapan Giliran FPB Beraksi? (Uji Coba Piring Tanpa Sisa &amp; Menyederhanakan Pecahan)</w:t>
+        <w:t>📌 Slide 5: Konsep Dasar FPB dari Nol &amp; Kapan Giliran FPB Beraksi? (Uji Coba Tas Atlet Tanpa Sisa)</w:t>
       </w:r>
     </w:p>
     <w:p>
@@ -747,7 +1015,7 @@
         <w:pStyle w:val="Heading3"/>
       </w:pPr>
       <w:r>
-        <w:t>📌 Slide 6: Peta Strategi &amp; Masuk ke Web Games</w:t>
+        <w:t>📌 Slide 6: Peta Strategi 2 Langkah &amp; Gerbang Web Game Mishka</w:t>
       </w:r>
     </w:p>
     <w:p>
@@ -777,6 +1045,199 @@
       </w:r>
       <w:r>
         <w:t>Guru: 'Luar biasa! Sekarang Mishka sudah memegang peta rahasia pecahan: KPK untuk menyamakan penyebut, FPB untuk menyederhanakan. Sekarang yuk kita buka website game Mishka! Mulai dengan tombol How are you today, lalu pakai kuas warna di Alat 1 untuk membuktikan angka KPK dan FPB di tabel 1-100!'</w:t>
+      </w:r>
+    </w:p>
+    <w:p>
+      <w:pPr>
+        <w:pStyle w:val="Heading2"/>
+      </w:pPr>
+      <w:r>
+        <w:t>🔬 IPAS (KELAS 5): BAB 3 MAGNET, LISTRIK, DAN TEKNOLOGI</w:t>
+      </w:r>
+    </w:p>
+    <w:p>
+      <w:pPr>
+        <w:pStyle w:val="Heading3"/>
+      </w:pPr>
+      <w:r>
+        <w:t>📌 Slide 1: Gaya Tak Terlihat (Dua Kutub Magnet)</w:t>
+      </w:r>
+    </w:p>
+    <w:p>
+      <w:r>
+        <w:rPr>
+          <w:b/>
+        </w:rPr>
+        <w:t>Teks di Slide Canva:</w:t>
+        <w:br/>
+      </w:r>
+      <w:r>
+        <w:t>Magnet punya dua kutub: Utara (U) &amp; Selatan (S)</w:t>
+        <w:br/>
+        <w:t>• Kutub Senama (U-U / S-S) ➜ TOLAK-MENOLAK ↔️</w:t>
+        <w:br/>
+        <w:t>• Kutub Berlawanan (U-S)  ➜ TARIK-MENARIK ➡️⬅️</w:t>
+        <w:br/>
+        <w:br/>
+      </w:r>
+      <w:r>
+        <w:rPr>
+          <w:b/>
+          <w:color w:val="4F46E5"/>
+        </w:rPr>
+        <w:t>🎙️ Naskah Dialog Guru (Word-by-Word):</w:t>
+        <w:br/>
+      </w:r>
+      <w:r>
+        <w:t>Guru: 'Mishka, pernah main magnet batang? Magnet punya dua kutub: Utara (U) dan Selatan (S). Kalau kutub yang sama (U-U) didekatkan, apa yang terjadi?'</w:t>
+        <w:br/>
+        <w:t>Mishka: 'Tolak-menolak, Bu, kayak ada benteng tak terlihat yang dorong!'</w:t>
+        <w:br/>
+        <w:t>Guru: 'Kalau kutub yang beda (U-S)?'</w:t>
+        <w:br/>
+        <w:t>Mishka: 'Langsung nempel tarik-menarik!'</w:t>
+        <w:br/>
+        <w:t>Guru: 'Tepat! Hukum alam magnet: Kutub senama tolak-menolak, kutub tak senama tarik-menarik!'</w:t>
+      </w:r>
+    </w:p>
+    <w:p>
+      <w:pPr>
+        <w:pStyle w:val="Heading3"/>
+      </w:pPr>
+      <w:r>
+        <w:t>📌 Slide 2: Teknologi Kereta Cepat Maglev</w:t>
+      </w:r>
+    </w:p>
+    <w:p>
+      <w:r>
+        <w:rPr>
+          <w:b/>
+        </w:rPr>
+        <w:t>Teks di Slide Canva:</w:t>
+        <w:br/>
+      </w:r>
+      <w:r>
+        <w:t>Kereta Melayang 600 km/jam Tanpa Roda Menyentuh Rel!</w:t>
+        <w:br/>
+        <w:t>Prinsip: Tolak-menolak gaya magnet senama mengangkat badan kereta 10 cm.</w:t>
+        <w:br/>
+        <w:br/>
+      </w:r>
+      <w:r>
+        <w:rPr>
+          <w:b/>
+          <w:color w:val="4F46E5"/>
+        </w:rPr>
+        <w:t>🎙️ Naskah Dialog Guru (Word-by-Word):</w:t>
+        <w:br/>
+      </w:r>
+      <w:r>
+        <w:t>Guru: 'Tahukah Mishka, di Jepang dan Cina ada kereta tercepat bernama Maglev yang bisa meluncur 600 km/jam tanpa roda menyentuh rel? Kereta itu memanfaatkan gaya tolak-menolak magnet senama sehingga keretanya melayang 10 cm di atas lintasan! Karena melayang dan tidak ada gesekan roda sama sekali, keretanya bisa melaju secepat pesawat terbang!'</w:t>
+      </w:r>
+    </w:p>
+    <w:p>
+      <w:pPr>
+        <w:pStyle w:val="Heading3"/>
+      </w:pPr>
+      <w:r>
+        <w:t>📌 Slide 3: Rangkaian Seri vs Paralel (Lampu Rumah)</w:t>
+      </w:r>
+    </w:p>
+    <w:p>
+      <w:r>
+        <w:rPr>
+          <w:b/>
+        </w:rPr>
+        <w:t>Teks di Slide Canva:</w:t>
+        <w:br/>
+      </w:r>
+      <w:r>
+        <w:t>• Rangkaian Seri: 1 Jalur Tunggal (1 mati, SEMUA MATI)</w:t>
+        <w:br/>
+        <w:t>• Rangkaian Paralel: Jalur Bercabang (1 mati, LAIN TETAP MENYALA!)</w:t>
+        <w:br/>
+        <w:br/>
+      </w:r>
+      <w:r>
+        <w:rPr>
+          <w:b/>
+          <w:color w:val="4F46E5"/>
+        </w:rPr>
+        <w:t>🎙️ Naskah Dialog Guru (Word-by-Word):</w:t>
+        <w:br/>
+      </w:r>
+      <w:r>
+        <w:t>Guru: 'Di rumah Mishka, kalau lampu kamar mandi dimatikan, apakah lampu kamar tidur ikut mati?'</w:t>
+        <w:br/>
+        <w:t>Mishka: 'Nggak, Bu, lampu kamar tetap nyala.'</w:t>
+        <w:br/>
+        <w:t>Guru: 'Kenapa begitu? Karena instalasi rumah menggunakan Rangkaian Paralel (jalur kawatnya bercabang mandiri)! Kalau pakai Rangkaian Seri (satu kabel lurus seperti lampu hias pohon natal), begitu satu lampu putus, seluruh rumah bakal padam gulita!'</w:t>
+      </w:r>
+    </w:p>
+    <w:p>
+      <w:pPr>
+        <w:pStyle w:val="Heading3"/>
+      </w:pPr>
+      <w:r>
+        <w:t>📌 Slide 4: Kolaborasi Listrik &amp; Magnet (Elektromagnet)</w:t>
+      </w:r>
+    </w:p>
+    <w:p>
+      <w:r>
+        <w:rPr>
+          <w:b/>
+        </w:rPr>
+        <w:t>Teks di Slide Canva:</w:t>
+        <w:br/>
+      </w:r>
+      <w:r>
+        <w:t>Elektromagnet = Magnet Sementara yang Diciptakan dari Arus Listrik!</w:t>
+        <w:br/>
+        <w:br/>
+      </w:r>
+      <w:r>
+        <w:rPr>
+          <w:b/>
+          <w:color w:val="4F46E5"/>
+        </w:rPr>
+        <w:t>🎙️ Naskah Dialog Guru (Word-by-Word):</w:t>
+        <w:br/>
+      </w:r>
+      <w:r>
+        <w:t>Guru: 'Kalau paku besi kita lilitkan kawat tembaga lalu kita hubungkan ke baterai, paku itu tiba-tiba berubah jadi magnet yang bisa menarik jarum pentul! Itu namanya Elektromagnet. Begitu kabel baterai dilepas, sifat magnetnya langsung hilang seketika!'</w:t>
+      </w:r>
+    </w:p>
+    <w:p>
+      <w:pPr>
+        <w:pStyle w:val="Heading3"/>
+      </w:pPr>
+      <w:r>
+        <w:t>📌 Slide 5: Pemanfaatan Teknologi di Sekitar Kita</w:t>
+      </w:r>
+    </w:p>
+    <w:p>
+      <w:r>
+        <w:rPr>
+          <w:b/>
+        </w:rPr>
+        <w:t>Teks di Slide Canva:</w:t>
+        <w:br/>
+      </w:r>
+      <w:r>
+        <w:t>Aplikasi Elektromagnet: Bel Rumah, Motor Mesin Cuci, Kipas Angin, Generator PLTA</w:t>
+        <w:br/>
+        <w:br/>
+      </w:r>
+      <w:r>
+        <w:rPr>
+          <w:b/>
+          <w:color w:val="4F46E5"/>
+        </w:rPr>
+        <w:t>🎙️ Naskah Dialog Guru (Word-by-Word):</w:t>
+        <w:br/>
+      </w:r>
+      <w:r>
+        <w:t>Guru: 'Elektromagnet inilah penemuan sains yang mengubah peradaban manusia: dia yang menggerakkan pemukul bel rumah, memutar dinamo mesin cuci, sampai memutar generator raksasa di pembangkit listrik tenaga air!'</w:t>
       </w:r>
     </w:p>
     <w:sectPr>
@@ -1239,7 +1700,7 @@
       <w:rFonts w:asciiTheme="majorHAnsi" w:eastAsiaTheme="majorEastAsia" w:hAnsiTheme="majorHAnsi" w:cstheme="majorBidi"/>
       <w:b/>
       <w:bCs/>
-      <w:color w:val="4F81BD" w:themeColor="accent1"/>
+      <w:color w:val="4F46E5"/>
       <w:sz w:val="26"/>
       <w:szCs w:val="26"/>
     </w:rPr>

</xml_diff>